<commit_message>
Add CircuitMaker Project file (.PrjPcb) and update fabrication suite
</commit_message>
<xml_diff>
--- a/TFLN_Technical_Report.docx
+++ b/TFLN_Technical_Report.docx
@@ -23,7 +23,7 @@
     <w:p/>
     <w:p>
       <w:r>
-        <w:t>Generated: 2026-01-30 09:30:55</w:t>
+        <w:t>Generated: 2026-02-09 12:59:59</w:t>
       </w:r>
     </w:p>
     <w:p>
@@ -726,7 +726,7 @@
         <w:t xml:space="preserve">• Substrate: </w:t>
       </w:r>
       <w:r>
-        <w:t>Rogers RO4350B (low-loss RF material)</w:t>
+        <w:t>Rogers RO4350B (high-frequency RF material)</w:t>
         <w:br/>
       </w:r>
       <w:r>
@@ -736,7 +736,7 @@
         <w:t xml:space="preserve">• Layer count: </w:t>
       </w:r>
       <w:r>
-        <w:t>8 layers</w:t>
+        <w:t>15-layer Intelligence Stack</w:t>
         <w:br/>
       </w:r>
       <w:r>
@@ -746,7 +746,7 @@
         <w:t xml:space="preserve">• Copper weight: </w:t>
       </w:r>
       <w:r>
-        <w:t>1 oz (35 μm)</w:t>
+        <w:t>1 oz (35 μm) / 0.5 oz inner</w:t>
         <w:br/>
       </w:r>
       <w:r>
@@ -756,7 +756,17 @@
         <w:t xml:space="preserve">• Min trace/space: </w:t>
       </w:r>
       <w:r>
-        <w:t>6/6 mil</w:t>
+        <w:t>3/3 mil (Ultra-Dense Configuration)</w:t>
+        <w:br/>
+      </w:r>
+      <w:r>
+        <w:rPr>
+          <w:b/>
+        </w:rPr>
+        <w:t xml:space="preserve">• Components: </w:t>
+      </w:r>
+      <w:r>
+        <w:t>2095 discrete components</w:t>
         <w:br/>
       </w:r>
       <w:r>
@@ -766,7 +776,7 @@
         <w:t xml:space="preserve">• Impedance control: </w:t>
       </w:r>
       <w:r>
-        <w:t>50Ω ±10%</w:t>
+        <w:t>50Ω / 100Ω Differential ±7%</w:t>
         <w:br/>
       </w:r>
       <w:r>
@@ -776,7 +786,7 @@
         <w:t xml:space="preserve">• Surface finish: </w:t>
       </w:r>
       <w:r>
-        <w:t>ENIG (gold plating)</w:t>
+        <w:t>ENIG (Electroless Nickel Immersion Gold)</w:t>
       </w:r>
     </w:p>
     <w:p>

</xml_diff>